<commit_message>
fix: WKZ/Kickback-Rechnungstitel und Festbonus-Label korrigieren
- WKZ und Kickback zeigen jetzt 'Werbekosten-Rechnung' statt 'Belastungsanzeige WKZ'
- Umsatzbonus bleibt 'Belastungsanzeige'
- Hardcoded 'Festbonus' aus invoice_bonus.docx-Template entfernt

Co-Authored-By: Claude Sonnet 4.6 <noreply@anthropic.com>
</commit_message>
<xml_diff>
--- a/data/templates/invoice_bonus.docx
+++ b/data/templates/invoice_bonus.docx
@@ -641,7 +641,6 @@
           <w:b/>
           <w:bCs/>
         </w:rPr>
-        <w:fldChar w:fldCharType="begin"/>
       </w:r>
       <w:r>
         <w:rPr>
@@ -649,7 +648,6 @@
           <w:b/>
           <w:bCs/>
         </w:rPr>
-        <w:instrText xml:space="preserve"> MERGEFIELD "Belastungstext" </w:instrText>
       </w:r>
       <w:r>
         <w:rPr>
@@ -657,7 +655,6 @@
           <w:b/>
           <w:bCs/>
         </w:rPr>
-        <w:fldChar w:fldCharType="separate"/>
       </w:r>
       <w:r>
         <w:rPr>
@@ -666,7 +663,6 @@
           <w:bCs/>
           <w:noProof/>
         </w:rPr>
-        <w:t>Festbonus</w:t>
       </w:r>
       <w:r>
         <w:rPr>
@@ -674,7 +670,6 @@
           <w:b/>
           <w:bCs/>
         </w:rPr>
-        <w:fldChar w:fldCharType="end"/>
       </w:r>
     </w:p>
     <w:p>

</xml_diff>

<commit_message>
feat: WKZ/Kickback-Vorlage mit korrekten Texten und Artikel-Auflistung
- Rechnungstitel zeigt jetzt Grund: 'Werbekosten-Rechnung – {Beschreibung}'
- Anschreiben bei WKZ/Kickback: 'wie mit Ihnen vereinbart, erhalten Sie
  heute die Werbekosten-Belastung.' + Danke-Satz
- Umsatzbonus-Anschreiben unverändert (Jinja2-Conditional im Template)
- Kickback: Artikel-Zeilen mit Menge, Einzelbetrag, Gesamt vor Nettosumme
- Kickback-Beträge mit deutschem Komma als Dezimaltrennzeichen
- items=[] als Default für WKZ/Umsatzbonus gesetzt

Co-Authored-By: Claude Sonnet 4.6 <noreply@anthropic.com>
</commit_message>
<xml_diff>
--- a/data/templates/invoice_bonus.docx
+++ b/data/templates/invoice_bonus.docx
@@ -572,59 +572,41 @@
         </w:rPr>
       </w:pPr>
       <w:r>
-        <w:rPr>
-          <w:rFonts w:ascii="Arial" w:hAnsi="Arial" w:cs="Arial"/>
-        </w:rPr>
-        <w:t xml:space="preserve">wie mit Ihrem Unternehmen vereinbart, erhalten Sie heute rückwirkend für das </w:t>
-      </w:r>
-    </w:p>
-    <w:p>
-      <w:pPr>
-        <w:spacing w:after="0"/>
-        <w:rPr>
-          <w:rFonts w:ascii="Arial" w:hAnsi="Arial" w:cs="Arial"/>
-        </w:rPr>
-      </w:pPr>
-      <w:r>
-        <w:rPr>
-          <w:rFonts w:ascii="Arial" w:hAnsi="Arial" w:cs="Arial"/>
-        </w:rPr>
-        <w:t>Geschäfts</w:t>
-      </w:r>
-      <w:r>
-        <w:rPr>
-          <w:rFonts w:ascii="Arial" w:hAnsi="Arial" w:cs="Arial"/>
-        </w:rPr>
-        <w:t xml:space="preserve">jahr </w:t>
-      </w:r>
-      <w:r>
-        <w:rPr>
-          <w:rFonts w:ascii="Arial" w:hAnsi="Arial" w:cs="Arial"/>
-        </w:rPr>
-        <w:t>{{JAHR}}</w:t>
-      </w:r>
-      <w:r>
-        <w:rPr>
-          <w:rFonts w:ascii="Arial" w:hAnsi="Arial" w:cs="Arial"/>
-        </w:rPr>
-        <w:t xml:space="preserve"> die entsprechende Bonusbelastung.</w:t>
-      </w:r>
-    </w:p>
-    <w:p>
-      <w:pPr>
-        <w:spacing w:after="0"/>
-        <w:rPr>
-          <w:rFonts w:ascii="Arial" w:hAnsi="Arial" w:cs="Arial"/>
-        </w:rPr>
-      </w:pPr>
-    </w:p>
-    <w:p>
-      <w:pPr>
-        <w:spacing w:after="0"/>
-        <w:rPr>
-          <w:rFonts w:ascii="Arial" w:hAnsi="Arial" w:cs="Arial"/>
-        </w:rPr>
-      </w:pPr>
+        <w:t xml:space="preserve">{%p if is_wkz_type %}wie mit Ihnen vereinbart, erhalten Sie heute die Werbekosten-Belastung.</w:t>
+      </w:r>
+    </w:p>
+    <w:p>
+      <w:pPr>
+        <w:spacing w:after="0"/>
+        <w:rPr>
+          <w:rFonts w:ascii="Arial" w:hAnsi="Arial" w:cs="Arial"/>
+        </w:rPr>
+      </w:pPr>
+      <w:r>
+        <w:t xml:space="preserve">{%p else %}wie mit Ihrem Unternehmen vereinbart, erhalten Sie heute rückwirkend für das Geschäftsjahr {{JAHR}} die entsprechende Bonusbelastung.</w:t>
+      </w:r>
+    </w:p>
+    <w:p>
+      <w:pPr>
+        <w:spacing w:after="0"/>
+        <w:rPr>
+          <w:rFonts w:ascii="Arial" w:hAnsi="Arial" w:cs="Arial"/>
+        </w:rPr>
+      </w:pPr>
+      <w:r>
+        <w:t xml:space="preserve">{%p endif %}</w:t>
+      </w:r>
+    </w:p>
+    <w:p>
+      <w:pPr>
+        <w:spacing w:after="0"/>
+        <w:rPr>
+          <w:rFonts w:ascii="Arial" w:hAnsi="Arial" w:cs="Arial"/>
+        </w:rPr>
+      </w:pPr>
+      <w:r>
+        <w:t xml:space="preserve">{%p if is_wkz_type %}Wir möchten uns auf diesem Weg nochmals herzlich bei Ihnen bedanken.</w:t>
+      </w:r>
     </w:p>
     <w:p>
       <w:pPr>
@@ -636,51 +618,31 @@
         </w:rPr>
       </w:pPr>
       <w:r>
+        <w:t xml:space="preserve">{%p endif %}</w:t>
+      </w:r>
+    </w:p>
+    <w:p>
+      <w:pPr>
+        <w:spacing w:after="0"/>
         <w:rPr>
           <w:rFonts w:ascii="Arial" w:hAnsi="Arial" w:cs="Arial"/>
           <w:b/>
           <w:bCs/>
         </w:rPr>
-      </w:r>
-      <w:r>
-        <w:rPr>
-          <w:rFonts w:ascii="Arial" w:hAnsi="Arial" w:cs="Arial"/>
-          <w:b/>
-          <w:bCs/>
-        </w:rPr>
-      </w:r>
-      <w:r>
-        <w:rPr>
-          <w:rFonts w:ascii="Arial" w:hAnsi="Arial" w:cs="Arial"/>
-          <w:b/>
-          <w:bCs/>
-        </w:rPr>
-      </w:r>
-      <w:r>
-        <w:rPr>
-          <w:rFonts w:ascii="Arial" w:hAnsi="Arial" w:cs="Arial"/>
-          <w:b/>
-          <w:bCs/>
-          <w:noProof/>
-        </w:rPr>
-      </w:r>
-      <w:r>
-        <w:rPr>
-          <w:rFonts w:ascii="Arial" w:hAnsi="Arial" w:cs="Arial"/>
-          <w:b/>
-          <w:bCs/>
-        </w:rPr>
-      </w:r>
-    </w:p>
-    <w:p>
-      <w:pPr>
-        <w:spacing w:after="0"/>
-        <w:rPr>
-          <w:rFonts w:ascii="Arial" w:hAnsi="Arial" w:cs="Arial"/>
-          <w:b/>
-          <w:bCs/>
-        </w:rPr>
-      </w:pPr>
+      </w:pPr>
+      <w:r>
+        <w:t xml:space="preserve">{%p for item in items %}</w:t>
+      </w:r>
+    </w:p>
+    <w:p>
+      <w:r>
+        <w:t xml:space="preserve">Art.-Nr.: {{item.article_number}}   Menge: {{item.qty}} Stk.   Einzelbetrag: {{item.rate}} €   Gesamt: {{item.line_amount}} €</w:t>
+      </w:r>
+    </w:p>
+    <w:p>
+      <w:r>
+        <w:t xml:space="preserve">{%p endfor %}</w:t>
+      </w:r>
     </w:p>
     <w:p>
       <w:pPr>

</xml_diff>

<commit_message>
fix: Template-Struktur für docxtpl korrekt, Arial-Schrift gesetzt
- {%p if %} und Inhalt in getrennten Absätzen (docxtpl-Anforderung)
  → behebt 'kein Text bei WKZ'-Bug
- Alle neuen Absätze mit Arial-Font in pPr/rPr und Run
- Korrekte Reihenfolge: if/content/else/content/endif für Anschreiben,
  if/Danke/endif, for/Artikel/endfor vor Nettosumme

Co-Authored-By: Claude Sonnet 4.6 <noreply@anthropic.com>
</commit_message>
<xml_diff>
--- a/data/templates/invoice_bonus.docx
+++ b/data/templates/invoice_bonus.docx
@@ -572,28 +572,65 @@
         </w:rPr>
       </w:pPr>
       <w:r>
-        <w:t xml:space="preserve">{%p if is_wkz_type %}wie mit Ihnen vereinbart, erhalten Sie heute die Werbekosten-Belastung.</w:t>
-      </w:r>
-    </w:p>
-    <w:p>
-      <w:pPr>
-        <w:spacing w:after="0"/>
-        <w:rPr>
-          <w:rFonts w:ascii="Arial" w:hAnsi="Arial" w:cs="Arial"/>
-        </w:rPr>
-      </w:pPr>
-      <w:r>
-        <w:t xml:space="preserve">{%p else %}wie mit Ihrem Unternehmen vereinbart, erhalten Sie heute rückwirkend für das Geschäftsjahr {{JAHR}} die entsprechende Bonusbelastung.</w:t>
-      </w:r>
-    </w:p>
-    <w:p>
-      <w:pPr>
-        <w:spacing w:after="0"/>
-        <w:rPr>
-          <w:rFonts w:ascii="Arial" w:hAnsi="Arial" w:cs="Arial"/>
-        </w:rPr>
-      </w:pPr>
-      <w:r>
+        <w:rPr>
+          <w:rFonts w:ascii="Arial" w:hAnsi="Arial" w:cs="Arial"/>
+        </w:rPr>
+        <w:t xml:space="preserve">{%p if is_wkz_type %}</w:t>
+      </w:r>
+    </w:p>
+    <w:p>
+      <w:pPr>
+        <w:spacing w:after="0"/>
+        <w:rPr>
+          <w:rFonts w:ascii="Arial" w:hAnsi="Arial" w:cs="Arial"/>
+        </w:rPr>
+      </w:pPr>
+      <w:r>
+        <w:rPr>
+          <w:rFonts w:ascii="Arial" w:hAnsi="Arial" w:cs="Arial"/>
+        </w:rPr>
+        <w:t xml:space="preserve">wie mit Ihnen vereinbart, erhalten Sie heute die Werbekosten-Belastung.</w:t>
+      </w:r>
+    </w:p>
+    <w:p>
+      <w:pPr>
+        <w:spacing w:after="0"/>
+        <w:rPr>
+          <w:rFonts w:ascii="Arial" w:hAnsi="Arial" w:cs="Arial"/>
+        </w:rPr>
+      </w:pPr>
+      <w:r>
+        <w:rPr>
+          <w:rFonts w:ascii="Arial" w:hAnsi="Arial" w:cs="Arial"/>
+        </w:rPr>
+        <w:t xml:space="preserve">{%p else %}</w:t>
+      </w:r>
+    </w:p>
+    <w:p>
+      <w:pPr>
+        <w:spacing w:after="0"/>
+        <w:rPr>
+          <w:rFonts w:ascii="Arial" w:hAnsi="Arial" w:cs="Arial"/>
+        </w:rPr>
+      </w:pPr>
+      <w:r>
+        <w:rPr>
+          <w:rFonts w:ascii="Arial" w:hAnsi="Arial" w:cs="Arial"/>
+        </w:rPr>
+        <w:t xml:space="preserve">wie mit Ihrem Unternehmen vereinbart, erhalten Sie heute rückwirkend für das Geschäftsjahr {{JAHR}} die entsprechende Bonusbelastung.</w:t>
+      </w:r>
+    </w:p>
+    <w:p>
+      <w:pPr>
+        <w:spacing w:after="0"/>
+        <w:rPr>
+          <w:rFonts w:ascii="Arial" w:hAnsi="Arial" w:cs="Arial"/>
+        </w:rPr>
+      </w:pPr>
+      <w:r>
+        <w:rPr>
+          <w:rFonts w:ascii="Arial" w:hAnsi="Arial" w:cs="Arial"/>
+        </w:rPr>
         <w:t xml:space="preserve">{%p endif %}</w:t>
       </w:r>
     </w:p>
@@ -605,19 +642,37 @@
         </w:rPr>
       </w:pPr>
       <w:r>
-        <w:t xml:space="preserve">{%p if is_wkz_type %}Wir möchten uns auf diesem Weg nochmals herzlich bei Ihnen bedanken.</w:t>
-      </w:r>
-    </w:p>
-    <w:p>
-      <w:pPr>
-        <w:spacing w:after="0"/>
-        <w:rPr>
-          <w:rFonts w:ascii="Arial" w:hAnsi="Arial" w:cs="Arial"/>
-          <w:b/>
-          <w:bCs/>
-        </w:rPr>
-      </w:pPr>
-      <w:r>
+        <w:rPr>
+          <w:rFonts w:ascii="Arial" w:hAnsi="Arial" w:cs="Arial"/>
+        </w:rPr>
+        <w:t xml:space="preserve">{%p if is_wkz_type %}</w:t>
+      </w:r>
+    </w:p>
+    <w:p>
+      <w:pPr>
+        <w:spacing w:after="0"/>
+        <w:rPr>
+          <w:rFonts w:ascii="Arial" w:hAnsi="Arial" w:cs="Arial"/>
+        </w:rPr>
+      </w:pPr>
+      <w:r>
+        <w:rPr>
+          <w:rFonts w:ascii="Arial" w:hAnsi="Arial" w:cs="Arial"/>
+        </w:rPr>
+        <w:t xml:space="preserve">Wir möchten uns auf diesem Weg nochmals herzlich bei Ihnen bedanken.</w:t>
+      </w:r>
+    </w:p>
+    <w:p>
+      <w:pPr>
+        <w:spacing w:after="0"/>
+        <w:rPr>
+          <w:rFonts w:ascii="Arial" w:hAnsi="Arial" w:cs="Arial"/>
+        </w:rPr>
+      </w:pPr>
+      <w:r>
+        <w:rPr>
+          <w:rFonts w:ascii="Arial" w:hAnsi="Arial" w:cs="Arial"/>
+        </w:rPr>
         <w:t xml:space="preserve">{%p endif %}</w:t>
       </w:r>
     </w:p>
@@ -626,21 +681,40 @@
         <w:spacing w:after="0"/>
         <w:rPr>
           <w:rFonts w:ascii="Arial" w:hAnsi="Arial" w:cs="Arial"/>
-          <w:b/>
-          <w:bCs/>
-        </w:rPr>
-      </w:pPr>
-      <w:r>
+        </w:rPr>
+      </w:pPr>
+      <w:r>
+        <w:rPr>
+          <w:rFonts w:ascii="Arial" w:hAnsi="Arial" w:cs="Arial"/>
+        </w:rPr>
         <w:t xml:space="preserve">{%p for item in items %}</w:t>
       </w:r>
     </w:p>
     <w:p>
-      <w:r>
+      <w:pPr>
+        <w:spacing w:after="0"/>
+        <w:rPr>
+          <w:rFonts w:ascii="Arial" w:hAnsi="Arial" w:cs="Arial"/>
+        </w:rPr>
+      </w:pPr>
+      <w:r>
+        <w:rPr>
+          <w:rFonts w:ascii="Arial" w:hAnsi="Arial" w:cs="Arial"/>
+        </w:rPr>
         <w:t xml:space="preserve">Art.-Nr.: {{item.article_number}}   Menge: {{item.qty}} Stk.   Einzelbetrag: {{item.rate}} €   Gesamt: {{item.line_amount}} €</w:t>
       </w:r>
     </w:p>
     <w:p>
-      <w:r>
+      <w:pPr>
+        <w:spacing w:after="0"/>
+        <w:rPr>
+          <w:rFonts w:ascii="Arial" w:hAnsi="Arial" w:cs="Arial"/>
+        </w:rPr>
+      </w:pPr>
+      <w:r>
+        <w:rPr>
+          <w:rFonts w:ascii="Arial" w:hAnsi="Arial" w:cs="Arial"/>
+        </w:rPr>
         <w:t xml:space="preserve">{%p endfor %}</w:t>
       </w:r>
     </w:p>

</xml_diff>

<commit_message>
fix: Leerzeile nach 'herzlich bei Ihnen bedanken' eingefügt
Co-Authored-By: Claude Sonnet 4.6 <noreply@anthropic.com>
</commit_message>
<xml_diff>
--- a/data/templates/invoice_bonus.docx
+++ b/data/templates/invoice_bonus.docx
@@ -661,6 +661,14 @@
         </w:rPr>
         <w:t xml:space="preserve">Wir möchten uns auf diesem Weg nochmals herzlich bei Ihnen bedanken.</w:t>
       </w:r>
+    </w:p>
+    <w:p>
+      <w:pPr>
+        <w:spacing w:after="0"/>
+        <w:rPr>
+          <w:rFonts w:ascii="Arial" w:hAnsi="Arial" w:cs="Arial"/>
+        </w:rPr>
+      </w:pPr>
     </w:p>
     <w:p>
       <w:pPr>

</xml_diff>

<commit_message>
fix: Leerzeile nach Kickback-Artikelliste vor Nettosumme eingefügt
Nur sichtbar wenn items vorhanden (Kickback), kein Extra-Abstand bei WKZ/Umsatzbonus.

Co-Authored-By: Claude Sonnet 4.6 <noreply@anthropic.com>
</commit_message>
<xml_diff>
--- a/data/templates/invoice_bonus.docx
+++ b/data/templates/invoice_bonus.docx
@@ -724,6 +724,42 @@
           <w:rFonts w:ascii="Arial" w:hAnsi="Arial" w:cs="Arial"/>
         </w:rPr>
         <w:t xml:space="preserve">{%p endfor %}</w:t>
+      </w:r>
+    </w:p>
+    <w:p>
+      <w:pPr>
+        <w:spacing w:after="0"/>
+        <w:rPr>
+          <w:rFonts w:ascii="Arial" w:hAnsi="Arial" w:cs="Arial"/>
+        </w:rPr>
+      </w:pPr>
+      <w:r>
+        <w:rPr>
+          <w:rFonts w:ascii="Arial" w:hAnsi="Arial" w:cs="Arial"/>
+        </w:rPr>
+        <w:t xml:space="preserve">{%p if items %}</w:t>
+      </w:r>
+    </w:p>
+    <w:p>
+      <w:pPr>
+        <w:spacing w:after="0"/>
+        <w:rPr>
+          <w:rFonts w:ascii="Arial" w:hAnsi="Arial" w:cs="Arial"/>
+        </w:rPr>
+      </w:pPr>
+    </w:p>
+    <w:p>
+      <w:pPr>
+        <w:spacing w:after="0"/>
+        <w:rPr>
+          <w:rFonts w:ascii="Arial" w:hAnsi="Arial" w:cs="Arial"/>
+        </w:rPr>
+      </w:pPr>
+      <w:r>
+        <w:rPr>
+          <w:rFonts w:ascii="Arial" w:hAnsi="Arial" w:cs="Arial"/>
+        </w:rPr>
+        <w:t xml:space="preserve">{%p endif %}</w:t>
       </w:r>
     </w:p>
     <w:p>

</xml_diff>